<commit_message>
Support distinct AI Foundry models for Table Summarizer and Migration Plan agents with strict execution enforcement
</commit_message>
<xml_diff>
--- a/BackEnd/AI_Agent_Pipeline/output/AI_Migration_Plan.docx
+++ b/BackEnd/AI_Agent_Pipeline/output/AI_Migration_Plan.docx
@@ -615,6 +615,189 @@
           </w:p>
         </w:tc>
       </w:tr>
+      <w:tr>
+        <w:tc>
+          <w:tcPr>
+            <w:tcW w:type="dxa" w:w="4320"/>
+            <w:shd w:val="clear" w:color="auto" w:fill="EAF1F5"/>
+            <w:tcMar>
+              <w:top w:w="100" w:type="dxa"/>
+              <w:bottom w:w="100" w:type="dxa"/>
+              <w:left w:w="120" w:type="dxa"/>
+              <w:right w:w="120" w:type="dxa"/>
+            </w:tcMar>
+          </w:tcPr>
+          <w:p>
+            <w:pPr>
+              <w:spacing w:before="80" w:after="80"/>
+              <w:jc w:val="left"/>
+            </w:pPr>
+            <w:r/>
+            <w:r>
+              <w:rPr>
+                <w:rFonts w:ascii="Aptos" w:hAnsi="Aptos"/>
+                <w:b/>
+                <w:i w:val="0"/>
+                <w:color w:val="0F4761"/>
+                <w:sz w:val="20"/>
+                <w:rFonts w:ascii="Aptos" w:hAnsi="Aptos"/>
+              </w:rPr>
+              <w:t>fact_dispute</w:t>
+            </w:r>
+          </w:p>
+        </w:tc>
+        <w:tc>
+          <w:tcPr>
+            <w:tcW w:type="dxa" w:w="4320"/>
+            <w:tcMar>
+              <w:top w:w="100" w:type="dxa"/>
+              <w:bottom w:w="100" w:type="dxa"/>
+              <w:left w:w="120" w:type="dxa"/>
+              <w:right w:w="120" w:type="dxa"/>
+            </w:tcMar>
+          </w:tcPr>
+          <w:p>
+            <w:pPr>
+              <w:spacing w:before="80" w:after="80"/>
+              <w:jc w:val="left"/>
+            </w:pPr>
+            <w:r/>
+            <w:r>
+              <w:rPr>
+                <w:rFonts w:ascii="Aptos" w:hAnsi="Aptos"/>
+                <w:b w:val="0"/>
+                <w:i w:val="0"/>
+                <w:color w:val="333333"/>
+                <w:sz w:val="20"/>
+                <w:rFonts w:ascii="Aptos" w:hAnsi="Aptos"/>
+              </w:rPr>
+              <w:t>Small</w:t>
+            </w:r>
+          </w:p>
+        </w:tc>
+      </w:tr>
+      <w:tr>
+        <w:tc>
+          <w:tcPr>
+            <w:tcW w:type="dxa" w:w="4320"/>
+            <w:shd w:val="clear" w:color="auto" w:fill="EAF1F5"/>
+            <w:tcMar>
+              <w:top w:w="100" w:type="dxa"/>
+              <w:bottom w:w="100" w:type="dxa"/>
+              <w:left w:w="120" w:type="dxa"/>
+              <w:right w:w="120" w:type="dxa"/>
+            </w:tcMar>
+          </w:tcPr>
+          <w:p>
+            <w:pPr>
+              <w:spacing w:before="80" w:after="80"/>
+              <w:jc w:val="left"/>
+            </w:pPr>
+            <w:r/>
+            <w:r>
+              <w:rPr>
+                <w:rFonts w:ascii="Aptos" w:hAnsi="Aptos"/>
+                <w:b/>
+                <w:i w:val="0"/>
+                <w:color w:val="0F4761"/>
+                <w:sz w:val="20"/>
+                <w:rFonts w:ascii="Aptos" w:hAnsi="Aptos"/>
+              </w:rPr>
+              <w:t>dim_account</w:t>
+            </w:r>
+          </w:p>
+        </w:tc>
+        <w:tc>
+          <w:tcPr>
+            <w:tcW w:type="dxa" w:w="4320"/>
+            <w:tcMar>
+              <w:top w:w="100" w:type="dxa"/>
+              <w:bottom w:w="100" w:type="dxa"/>
+              <w:left w:w="120" w:type="dxa"/>
+              <w:right w:w="120" w:type="dxa"/>
+            </w:tcMar>
+          </w:tcPr>
+          <w:p>
+            <w:pPr>
+              <w:spacing w:before="80" w:after="80"/>
+              <w:jc w:val="left"/>
+            </w:pPr>
+            <w:r/>
+            <w:r>
+              <w:rPr>
+                <w:rFonts w:ascii="Aptos" w:hAnsi="Aptos"/>
+                <w:b w:val="0"/>
+                <w:i w:val="0"/>
+                <w:color w:val="333333"/>
+                <w:sz w:val="20"/>
+                <w:rFonts w:ascii="Aptos" w:hAnsi="Aptos"/>
+              </w:rPr>
+              <w:t>Medium</w:t>
+            </w:r>
+          </w:p>
+        </w:tc>
+      </w:tr>
+      <w:tr>
+        <w:tc>
+          <w:tcPr>
+            <w:tcW w:type="dxa" w:w="4320"/>
+            <w:shd w:val="clear" w:color="auto" w:fill="EAF1F5"/>
+            <w:tcMar>
+              <w:top w:w="100" w:type="dxa"/>
+              <w:bottom w:w="100" w:type="dxa"/>
+              <w:left w:w="120" w:type="dxa"/>
+              <w:right w:w="120" w:type="dxa"/>
+            </w:tcMar>
+          </w:tcPr>
+          <w:p>
+            <w:pPr>
+              <w:spacing w:before="80" w:after="80"/>
+              <w:jc w:val="left"/>
+            </w:pPr>
+            <w:r/>
+            <w:r>
+              <w:rPr>
+                <w:rFonts w:ascii="Aptos" w:hAnsi="Aptos"/>
+                <w:b/>
+                <w:i w:val="0"/>
+                <w:color w:val="0F4761"/>
+                <w:sz w:val="20"/>
+                <w:rFonts w:ascii="Aptos" w:hAnsi="Aptos"/>
+              </w:rPr>
+              <w:t>dim_branch</w:t>
+            </w:r>
+          </w:p>
+        </w:tc>
+        <w:tc>
+          <w:tcPr>
+            <w:tcW w:type="dxa" w:w="4320"/>
+            <w:tcMar>
+              <w:top w:w="100" w:type="dxa"/>
+              <w:bottom w:w="100" w:type="dxa"/>
+              <w:left w:w="120" w:type="dxa"/>
+              <w:right w:w="120" w:type="dxa"/>
+            </w:tcMar>
+          </w:tcPr>
+          <w:p>
+            <w:pPr>
+              <w:spacing w:before="80" w:after="80"/>
+              <w:jc w:val="left"/>
+            </w:pPr>
+            <w:r/>
+            <w:r>
+              <w:rPr>
+                <w:rFonts w:ascii="Aptos" w:hAnsi="Aptos"/>
+                <w:b w:val="0"/>
+                <w:i w:val="0"/>
+                <w:color w:val="333333"/>
+                <w:sz w:val="20"/>
+                <w:rFonts w:ascii="Aptos" w:hAnsi="Aptos"/>
+              </w:rPr>
+              <w:t>Small</w:t>
+            </w:r>
+          </w:p>
+        </w:tc>
+      </w:tr>
     </w:tbl>
     <w:p>
       <w:pPr>
@@ -1303,7 +1486,7 @@
                 <w:sz w:val="20"/>
                 <w:rFonts w:ascii="Aptos" w:hAnsi="Aptos"/>
               </w:rPr>
-              <w:t>archived_orders_view</w:t>
+              <w:t>fact_dispute</w:t>
             </w:r>
           </w:p>
         </w:tc>
@@ -1332,7 +1515,7 @@
                 <w:sz w:val="20"/>
                 <w:rFonts w:ascii="Aptos" w:hAnsi="Aptos"/>
               </w:rPr>
-              <w:t>order_id</w:t>
+              <w:t>dispute_id</w:t>
             </w:r>
           </w:p>
         </w:tc>
@@ -1393,7 +1576,7 @@
                 <w:sz w:val="20"/>
                 <w:rFonts w:ascii="Aptos" w:hAnsi="Aptos"/>
               </w:rPr>
-              <w:t>archived_orders_view</w:t>
+              <w:t>fact_dispute</w:t>
             </w:r>
           </w:p>
         </w:tc>
@@ -1422,7 +1605,547 @@
                 <w:sz w:val="20"/>
                 <w:rFonts w:ascii="Aptos" w:hAnsi="Aptos"/>
               </w:rPr>
+              <w:t>card_id</w:t>
+            </w:r>
+          </w:p>
+        </w:tc>
+        <w:tc>
+          <w:tcPr>
+            <w:tcW w:type="dxa" w:w="2880"/>
+            <w:tcMar>
+              <w:top w:w="100" w:type="dxa"/>
+              <w:bottom w:w="100" w:type="dxa"/>
+              <w:left w:w="120" w:type="dxa"/>
+              <w:right w:w="120" w:type="dxa"/>
+            </w:tcMar>
+          </w:tcPr>
+          <w:p>
+            <w:pPr>
+              <w:spacing w:before="80" w:after="80"/>
+              <w:jc w:val="left"/>
+            </w:pPr>
+            <w:r/>
+            <w:r>
+              <w:rPr>
+                <w:rFonts w:ascii="Aptos" w:hAnsi="Aptos"/>
+                <w:b w:val="0"/>
+                <w:i w:val="0"/>
+                <w:color w:val="333333"/>
+                <w:sz w:val="20"/>
+                <w:rFonts w:ascii="Aptos" w:hAnsi="Aptos"/>
+              </w:rPr>
+              <w:t>Primary</w:t>
+            </w:r>
+          </w:p>
+        </w:tc>
+      </w:tr>
+      <w:tr>
+        <w:tc>
+          <w:tcPr>
+            <w:tcW w:type="dxa" w:w="2880"/>
+            <w:shd w:val="clear" w:color="auto" w:fill="EAF1F5"/>
+            <w:tcMar>
+              <w:top w:w="100" w:type="dxa"/>
+              <w:bottom w:w="100" w:type="dxa"/>
+              <w:left w:w="120" w:type="dxa"/>
+              <w:right w:w="120" w:type="dxa"/>
+            </w:tcMar>
+          </w:tcPr>
+          <w:p>
+            <w:pPr>
+              <w:spacing w:before="80" w:after="80"/>
+              <w:jc w:val="left"/>
+            </w:pPr>
+            <w:r/>
+            <w:r>
+              <w:rPr>
+                <w:rFonts w:ascii="Aptos" w:hAnsi="Aptos"/>
+                <w:b/>
+                <w:i w:val="0"/>
+                <w:color w:val="0F4761"/>
+                <w:sz w:val="20"/>
+                <w:rFonts w:ascii="Aptos" w:hAnsi="Aptos"/>
+              </w:rPr>
+              <w:t>fact_dispute</w:t>
+            </w:r>
+          </w:p>
+        </w:tc>
+        <w:tc>
+          <w:tcPr>
+            <w:tcW w:type="dxa" w:w="2880"/>
+            <w:tcMar>
+              <w:top w:w="100" w:type="dxa"/>
+              <w:bottom w:w="100" w:type="dxa"/>
+              <w:left w:w="120" w:type="dxa"/>
+              <w:right w:w="120" w:type="dxa"/>
+            </w:tcMar>
+          </w:tcPr>
+          <w:p>
+            <w:pPr>
+              <w:spacing w:before="80" w:after="80"/>
+              <w:jc w:val="left"/>
+            </w:pPr>
+            <w:r/>
+            <w:r>
+              <w:rPr>
+                <w:rFonts w:ascii="Aptos" w:hAnsi="Aptos"/>
+                <w:b w:val="0"/>
+                <w:i w:val="0"/>
+                <w:color w:val="333333"/>
+                <w:sz w:val="20"/>
+                <w:rFonts w:ascii="Aptos" w:hAnsi="Aptos"/>
+              </w:rPr>
+              <w:t>card_txn_id</w:t>
+            </w:r>
+          </w:p>
+        </w:tc>
+        <w:tc>
+          <w:tcPr>
+            <w:tcW w:type="dxa" w:w="2880"/>
+            <w:tcMar>
+              <w:top w:w="100" w:type="dxa"/>
+              <w:bottom w:w="100" w:type="dxa"/>
+              <w:left w:w="120" w:type="dxa"/>
+              <w:right w:w="120" w:type="dxa"/>
+            </w:tcMar>
+          </w:tcPr>
+          <w:p>
+            <w:pPr>
+              <w:spacing w:before="80" w:after="80"/>
+              <w:jc w:val="left"/>
+            </w:pPr>
+            <w:r/>
+            <w:r>
+              <w:rPr>
+                <w:rFonts w:ascii="Aptos" w:hAnsi="Aptos"/>
+                <w:b w:val="0"/>
+                <w:i w:val="0"/>
+                <w:color w:val="333333"/>
+                <w:sz w:val="20"/>
+                <w:rFonts w:ascii="Aptos" w:hAnsi="Aptos"/>
+              </w:rPr>
+              <w:t>Primary</w:t>
+            </w:r>
+          </w:p>
+        </w:tc>
+      </w:tr>
+      <w:tr>
+        <w:tc>
+          <w:tcPr>
+            <w:tcW w:type="dxa" w:w="2880"/>
+            <w:shd w:val="clear" w:color="auto" w:fill="EAF1F5"/>
+            <w:tcMar>
+              <w:top w:w="100" w:type="dxa"/>
+              <w:bottom w:w="100" w:type="dxa"/>
+              <w:left w:w="120" w:type="dxa"/>
+              <w:right w:w="120" w:type="dxa"/>
+            </w:tcMar>
+          </w:tcPr>
+          <w:p>
+            <w:pPr>
+              <w:spacing w:before="80" w:after="80"/>
+              <w:jc w:val="left"/>
+            </w:pPr>
+            <w:r/>
+            <w:r>
+              <w:rPr>
+                <w:rFonts w:ascii="Aptos" w:hAnsi="Aptos"/>
+                <w:b/>
+                <w:i w:val="0"/>
+                <w:color w:val="0F4761"/>
+                <w:sz w:val="20"/>
+                <w:rFonts w:ascii="Aptos" w:hAnsi="Aptos"/>
+              </w:rPr>
+              <w:t>fact_dispute</w:t>
+            </w:r>
+          </w:p>
+        </w:tc>
+        <w:tc>
+          <w:tcPr>
+            <w:tcW w:type="dxa" w:w="2880"/>
+            <w:tcMar>
+              <w:top w:w="100" w:type="dxa"/>
+              <w:bottom w:w="100" w:type="dxa"/>
+              <w:left w:w="120" w:type="dxa"/>
+              <w:right w:w="120" w:type="dxa"/>
+            </w:tcMar>
+          </w:tcPr>
+          <w:p>
+            <w:pPr>
+              <w:spacing w:before="80" w:after="80"/>
+              <w:jc w:val="left"/>
+            </w:pPr>
+            <w:r/>
+            <w:r>
+              <w:rPr>
+                <w:rFonts w:ascii="Aptos" w:hAnsi="Aptos"/>
+                <w:b w:val="0"/>
+                <w:i w:val="0"/>
+                <w:color w:val="333333"/>
+                <w:sz w:val="20"/>
+                <w:rFonts w:ascii="Aptos" w:hAnsi="Aptos"/>
+              </w:rPr>
+              <w:t>analyst_id</w:t>
+            </w:r>
+          </w:p>
+        </w:tc>
+        <w:tc>
+          <w:tcPr>
+            <w:tcW w:type="dxa" w:w="2880"/>
+            <w:tcMar>
+              <w:top w:w="100" w:type="dxa"/>
+              <w:bottom w:w="100" w:type="dxa"/>
+              <w:left w:w="120" w:type="dxa"/>
+              <w:right w:w="120" w:type="dxa"/>
+            </w:tcMar>
+          </w:tcPr>
+          <w:p>
+            <w:pPr>
+              <w:spacing w:before="80" w:after="80"/>
+              <w:jc w:val="left"/>
+            </w:pPr>
+            <w:r/>
+            <w:r>
+              <w:rPr>
+                <w:rFonts w:ascii="Aptos" w:hAnsi="Aptos"/>
+                <w:b w:val="0"/>
+                <w:i w:val="0"/>
+                <w:color w:val="333333"/>
+                <w:sz w:val="20"/>
+                <w:rFonts w:ascii="Aptos" w:hAnsi="Aptos"/>
+              </w:rPr>
+              <w:t>Primary</w:t>
+            </w:r>
+          </w:p>
+        </w:tc>
+      </w:tr>
+      <w:tr>
+        <w:tc>
+          <w:tcPr>
+            <w:tcW w:type="dxa" w:w="2880"/>
+            <w:shd w:val="clear" w:color="auto" w:fill="EAF1F5"/>
+            <w:tcMar>
+              <w:top w:w="100" w:type="dxa"/>
+              <w:bottom w:w="100" w:type="dxa"/>
+              <w:left w:w="120" w:type="dxa"/>
+              <w:right w:w="120" w:type="dxa"/>
+            </w:tcMar>
+          </w:tcPr>
+          <w:p>
+            <w:pPr>
+              <w:spacing w:before="80" w:after="80"/>
+              <w:jc w:val="left"/>
+            </w:pPr>
+            <w:r/>
+            <w:r>
+              <w:rPr>
+                <w:rFonts w:ascii="Aptos" w:hAnsi="Aptos"/>
+                <w:b/>
+                <w:i w:val="0"/>
+                <w:color w:val="0F4761"/>
+                <w:sz w:val="20"/>
+                <w:rFonts w:ascii="Aptos" w:hAnsi="Aptos"/>
+              </w:rPr>
+              <w:t>dim_account</w:t>
+            </w:r>
+          </w:p>
+        </w:tc>
+        <w:tc>
+          <w:tcPr>
+            <w:tcW w:type="dxa" w:w="2880"/>
+            <w:tcMar>
+              <w:top w:w="100" w:type="dxa"/>
+              <w:bottom w:w="100" w:type="dxa"/>
+              <w:left w:w="120" w:type="dxa"/>
+              <w:right w:w="120" w:type="dxa"/>
+            </w:tcMar>
+          </w:tcPr>
+          <w:p>
+            <w:pPr>
+              <w:spacing w:before="80" w:after="80"/>
+              <w:jc w:val="left"/>
+            </w:pPr>
+            <w:r/>
+            <w:r>
+              <w:rPr>
+                <w:rFonts w:ascii="Aptos" w:hAnsi="Aptos"/>
+                <w:b w:val="0"/>
+                <w:i w:val="0"/>
+                <w:color w:val="333333"/>
+                <w:sz w:val="20"/>
+                <w:rFonts w:ascii="Aptos" w:hAnsi="Aptos"/>
+              </w:rPr>
+              <w:t>account_id</w:t>
+            </w:r>
+          </w:p>
+        </w:tc>
+        <w:tc>
+          <w:tcPr>
+            <w:tcW w:type="dxa" w:w="2880"/>
+            <w:tcMar>
+              <w:top w:w="100" w:type="dxa"/>
+              <w:bottom w:w="100" w:type="dxa"/>
+              <w:left w:w="120" w:type="dxa"/>
+              <w:right w:w="120" w:type="dxa"/>
+            </w:tcMar>
+          </w:tcPr>
+          <w:p>
+            <w:pPr>
+              <w:spacing w:before="80" w:after="80"/>
+              <w:jc w:val="left"/>
+            </w:pPr>
+            <w:r/>
+            <w:r>
+              <w:rPr>
+                <w:rFonts w:ascii="Aptos" w:hAnsi="Aptos"/>
+                <w:b w:val="0"/>
+                <w:i w:val="0"/>
+                <w:color w:val="333333"/>
+                <w:sz w:val="20"/>
+                <w:rFonts w:ascii="Aptos" w:hAnsi="Aptos"/>
+              </w:rPr>
+              <w:t>Primary</w:t>
+            </w:r>
+          </w:p>
+        </w:tc>
+      </w:tr>
+      <w:tr>
+        <w:tc>
+          <w:tcPr>
+            <w:tcW w:type="dxa" w:w="2880"/>
+            <w:shd w:val="clear" w:color="auto" w:fill="EAF1F5"/>
+            <w:tcMar>
+              <w:top w:w="100" w:type="dxa"/>
+              <w:bottom w:w="100" w:type="dxa"/>
+              <w:left w:w="120" w:type="dxa"/>
+              <w:right w:w="120" w:type="dxa"/>
+            </w:tcMar>
+          </w:tcPr>
+          <w:p>
+            <w:pPr>
+              <w:spacing w:before="80" w:after="80"/>
+              <w:jc w:val="left"/>
+            </w:pPr>
+            <w:r/>
+            <w:r>
+              <w:rPr>
+                <w:rFonts w:ascii="Aptos" w:hAnsi="Aptos"/>
+                <w:b/>
+                <w:i w:val="0"/>
+                <w:color w:val="0F4761"/>
+                <w:sz w:val="20"/>
+                <w:rFonts w:ascii="Aptos" w:hAnsi="Aptos"/>
+              </w:rPr>
+              <w:t>dim_account</w:t>
+            </w:r>
+          </w:p>
+        </w:tc>
+        <w:tc>
+          <w:tcPr>
+            <w:tcW w:type="dxa" w:w="2880"/>
+            <w:tcMar>
+              <w:top w:w="100" w:type="dxa"/>
+              <w:bottom w:w="100" w:type="dxa"/>
+              <w:left w:w="120" w:type="dxa"/>
+              <w:right w:w="120" w:type="dxa"/>
+            </w:tcMar>
+          </w:tcPr>
+          <w:p>
+            <w:pPr>
+              <w:spacing w:before="80" w:after="80"/>
+              <w:jc w:val="left"/>
+            </w:pPr>
+            <w:r/>
+            <w:r>
+              <w:rPr>
+                <w:rFonts w:ascii="Aptos" w:hAnsi="Aptos"/>
+                <w:b w:val="0"/>
+                <w:i w:val="0"/>
+                <w:color w:val="333333"/>
+                <w:sz w:val="20"/>
+                <w:rFonts w:ascii="Aptos" w:hAnsi="Aptos"/>
+              </w:rPr>
               <w:t>customer_id</w:t>
+            </w:r>
+          </w:p>
+        </w:tc>
+        <w:tc>
+          <w:tcPr>
+            <w:tcW w:type="dxa" w:w="2880"/>
+            <w:tcMar>
+              <w:top w:w="100" w:type="dxa"/>
+              <w:bottom w:w="100" w:type="dxa"/>
+              <w:left w:w="120" w:type="dxa"/>
+              <w:right w:w="120" w:type="dxa"/>
+            </w:tcMar>
+          </w:tcPr>
+          <w:p>
+            <w:pPr>
+              <w:spacing w:before="80" w:after="80"/>
+              <w:jc w:val="left"/>
+            </w:pPr>
+            <w:r/>
+            <w:r>
+              <w:rPr>
+                <w:rFonts w:ascii="Aptos" w:hAnsi="Aptos"/>
+                <w:b w:val="0"/>
+                <w:i w:val="0"/>
+                <w:color w:val="333333"/>
+                <w:sz w:val="20"/>
+                <w:rFonts w:ascii="Aptos" w:hAnsi="Aptos"/>
+              </w:rPr>
+              <w:t>Primary</w:t>
+            </w:r>
+          </w:p>
+        </w:tc>
+      </w:tr>
+      <w:tr>
+        <w:tc>
+          <w:tcPr>
+            <w:tcW w:type="dxa" w:w="2880"/>
+            <w:shd w:val="clear" w:color="auto" w:fill="EAF1F5"/>
+            <w:tcMar>
+              <w:top w:w="100" w:type="dxa"/>
+              <w:bottom w:w="100" w:type="dxa"/>
+              <w:left w:w="120" w:type="dxa"/>
+              <w:right w:w="120" w:type="dxa"/>
+            </w:tcMar>
+          </w:tcPr>
+          <w:p>
+            <w:pPr>
+              <w:spacing w:before="80" w:after="80"/>
+              <w:jc w:val="left"/>
+            </w:pPr>
+            <w:r/>
+            <w:r>
+              <w:rPr>
+                <w:rFonts w:ascii="Aptos" w:hAnsi="Aptos"/>
+                <w:b/>
+                <w:i w:val="0"/>
+                <w:color w:val="0F4761"/>
+                <w:sz w:val="20"/>
+                <w:rFonts w:ascii="Aptos" w:hAnsi="Aptos"/>
+              </w:rPr>
+              <w:t>dim_account</w:t>
+            </w:r>
+          </w:p>
+        </w:tc>
+        <w:tc>
+          <w:tcPr>
+            <w:tcW w:type="dxa" w:w="2880"/>
+            <w:tcMar>
+              <w:top w:w="100" w:type="dxa"/>
+              <w:bottom w:w="100" w:type="dxa"/>
+              <w:left w:w="120" w:type="dxa"/>
+              <w:right w:w="120" w:type="dxa"/>
+            </w:tcMar>
+          </w:tcPr>
+          <w:p>
+            <w:pPr>
+              <w:spacing w:before="80" w:after="80"/>
+              <w:jc w:val="left"/>
+            </w:pPr>
+            <w:r/>
+            <w:r>
+              <w:rPr>
+                <w:rFonts w:ascii="Aptos" w:hAnsi="Aptos"/>
+                <w:b w:val="0"/>
+                <w:i w:val="0"/>
+                <w:color w:val="333333"/>
+                <w:sz w:val="20"/>
+                <w:rFonts w:ascii="Aptos" w:hAnsi="Aptos"/>
+              </w:rPr>
+              <w:t>branch_id</w:t>
+            </w:r>
+          </w:p>
+        </w:tc>
+        <w:tc>
+          <w:tcPr>
+            <w:tcW w:type="dxa" w:w="2880"/>
+            <w:tcMar>
+              <w:top w:w="100" w:type="dxa"/>
+              <w:bottom w:w="100" w:type="dxa"/>
+              <w:left w:w="120" w:type="dxa"/>
+              <w:right w:w="120" w:type="dxa"/>
+            </w:tcMar>
+          </w:tcPr>
+          <w:p>
+            <w:pPr>
+              <w:spacing w:before="80" w:after="80"/>
+              <w:jc w:val="left"/>
+            </w:pPr>
+            <w:r/>
+            <w:r>
+              <w:rPr>
+                <w:rFonts w:ascii="Aptos" w:hAnsi="Aptos"/>
+                <w:b w:val="0"/>
+                <w:i w:val="0"/>
+                <w:color w:val="333333"/>
+                <w:sz w:val="20"/>
+                <w:rFonts w:ascii="Aptos" w:hAnsi="Aptos"/>
+              </w:rPr>
+              <w:t>Primary</w:t>
+            </w:r>
+          </w:p>
+        </w:tc>
+      </w:tr>
+      <w:tr>
+        <w:tc>
+          <w:tcPr>
+            <w:tcW w:type="dxa" w:w="2880"/>
+            <w:shd w:val="clear" w:color="auto" w:fill="EAF1F5"/>
+            <w:tcMar>
+              <w:top w:w="100" w:type="dxa"/>
+              <w:bottom w:w="100" w:type="dxa"/>
+              <w:left w:w="120" w:type="dxa"/>
+              <w:right w:w="120" w:type="dxa"/>
+            </w:tcMar>
+          </w:tcPr>
+          <w:p>
+            <w:pPr>
+              <w:spacing w:before="80" w:after="80"/>
+              <w:jc w:val="left"/>
+            </w:pPr>
+            <w:r/>
+            <w:r>
+              <w:rPr>
+                <w:rFonts w:ascii="Aptos" w:hAnsi="Aptos"/>
+                <w:b/>
+                <w:i w:val="0"/>
+                <w:color w:val="0F4761"/>
+                <w:sz w:val="20"/>
+                <w:rFonts w:ascii="Aptos" w:hAnsi="Aptos"/>
+              </w:rPr>
+              <w:t>dim_branch</w:t>
+            </w:r>
+          </w:p>
+        </w:tc>
+        <w:tc>
+          <w:tcPr>
+            <w:tcW w:type="dxa" w:w="2880"/>
+            <w:tcMar>
+              <w:top w:w="100" w:type="dxa"/>
+              <w:bottom w:w="100" w:type="dxa"/>
+              <w:left w:w="120" w:type="dxa"/>
+              <w:right w:w="120" w:type="dxa"/>
+            </w:tcMar>
+          </w:tcPr>
+          <w:p>
+            <w:pPr>
+              <w:spacing w:before="80" w:after="80"/>
+              <w:jc w:val="left"/>
+            </w:pPr>
+            <w:r/>
+            <w:r>
+              <w:rPr>
+                <w:rFonts w:ascii="Aptos" w:hAnsi="Aptos"/>
+                <w:b w:val="0"/>
+                <w:i w:val="0"/>
+                <w:color w:val="333333"/>
+                <w:sz w:val="20"/>
+                <w:rFonts w:ascii="Aptos" w:hAnsi="Aptos"/>
+              </w:rPr>
+              <w:t>branch_id</w:t>
             </w:r>
           </w:p>
         </w:tc>
@@ -1489,6 +2212,40 @@
           <w:rFonts w:ascii="Aptos" w:hAnsi="Aptos"/>
         </w:rPr>
         <w:t>fact_card_transaction(card_id) references dim_card(id)</w:t>
+      </w:r>
+    </w:p>
+    <w:p>
+      <w:pPr>
+        <w:pStyle w:val="ListBullet"/>
+        <w:spacing w:after="80"/>
+        <w:jc w:val="both"/>
+      </w:pPr>
+      <w:r>
+        <w:rPr>
+          <w:rFonts w:ascii="Aptos" w:hAnsi="Aptos"/>
+          <w:b w:val="0"/>
+          <w:i w:val="0"/>
+          <w:sz w:val="24"/>
+          <w:rFonts w:ascii="Aptos" w:hAnsi="Aptos"/>
+        </w:rPr>
+        <w:t>fact_dispute(card_id) references dim_card(id)</w:t>
+      </w:r>
+    </w:p>
+    <w:p>
+      <w:pPr>
+        <w:pStyle w:val="ListBullet"/>
+        <w:spacing w:after="80"/>
+        <w:jc w:val="both"/>
+      </w:pPr>
+      <w:r>
+        <w:rPr>
+          <w:rFonts w:ascii="Aptos" w:hAnsi="Aptos"/>
+          <w:b w:val="0"/>
+          <w:i w:val="0"/>
+          <w:sz w:val="24"/>
+          <w:rFonts w:ascii="Aptos" w:hAnsi="Aptos"/>
+        </w:rPr>
+        <w:t>dim_account(branch_id) references dim_branch(id)</w:t>
       </w:r>
     </w:p>
     <w:p>
@@ -1730,7 +2487,7 @@
                 <w:sz w:val="20"/>
                 <w:rFonts w:ascii="Aptos" w:hAnsi="Aptos"/>
               </w:rPr>
-              <w:t>2</w:t>
+              <w:t>5</w:t>
             </w:r>
           </w:p>
         </w:tc>
@@ -1791,7 +2548,7 @@
                 <w:sz w:val="20"/>
                 <w:rFonts w:ascii="Aptos" w:hAnsi="Aptos"/>
               </w:rPr>
-              <w:t>50</w:t>
+              <w:t>91</w:t>
             </w:r>
           </w:p>
         </w:tc>
@@ -1852,7 +2609,7 @@
                 <w:sz w:val="20"/>
                 <w:rFonts w:ascii="Aptos" w:hAnsi="Aptos"/>
               </w:rPr>
-              <w:t>cards</w:t>
+              <w:t>cards, core_banking</w:t>
             </w:r>
           </w:p>
         </w:tc>
@@ -1913,7 +2670,7 @@
                 <w:sz w:val="20"/>
                 <w:rFonts w:ascii="Aptos" w:hAnsi="Aptos"/>
               </w:rPr>
-              <w:t>4.09 MB</w:t>
+              <w:t>4.54 MB</w:t>
             </w:r>
           </w:p>
         </w:tc>
@@ -1974,7 +2731,7 @@
                 <w:sz w:val="20"/>
                 <w:rFonts w:ascii="Aptos" w:hAnsi="Aptos"/>
               </w:rPr>
-              <w:t>129000 rows</w:t>
+              <w:t>137275 rows</w:t>
             </w:r>
           </w:p>
         </w:tc>
@@ -2035,7 +2792,7 @@
                 <w:sz w:val="20"/>
                 <w:rFonts w:ascii="Aptos" w:hAnsi="Aptos"/>
               </w:rPr>
-              <w:t>1</w:t>
+              <w:t>0</w:t>
             </w:r>
           </w:p>
         </w:tc>
@@ -2698,6 +3455,450 @@
                 <w:rFonts w:ascii="Aptos" w:hAnsi="Aptos"/>
               </w:rPr>
               <w:t>card_id</w:t>
+            </w:r>
+          </w:p>
+        </w:tc>
+      </w:tr>
+      <w:tr>
+        <w:tc>
+          <w:tcPr>
+            <w:tcW w:type="dxa" w:w="1728"/>
+            <w:shd w:val="clear" w:color="auto" w:fill="EAF1F5"/>
+            <w:tcMar>
+              <w:top w:w="100" w:type="dxa"/>
+              <w:bottom w:w="100" w:type="dxa"/>
+              <w:left w:w="120" w:type="dxa"/>
+              <w:right w:w="120" w:type="dxa"/>
+            </w:tcMar>
+          </w:tcPr>
+          <w:p>
+            <w:pPr>
+              <w:spacing w:before="80" w:after="80"/>
+              <w:jc w:val="left"/>
+            </w:pPr>
+            <w:r/>
+            <w:r>
+              <w:rPr>
+                <w:rFonts w:ascii="Aptos" w:hAnsi="Aptos"/>
+                <w:b/>
+                <w:i w:val="0"/>
+                <w:color w:val="0F4761"/>
+                <w:sz w:val="20"/>
+                <w:rFonts w:ascii="Aptos" w:hAnsi="Aptos"/>
+              </w:rPr>
+              <w:t>fact_dispute</w:t>
+            </w:r>
+          </w:p>
+        </w:tc>
+        <w:tc>
+          <w:tcPr>
+            <w:tcW w:type="dxa" w:w="1728"/>
+            <w:tcMar>
+              <w:top w:w="100" w:type="dxa"/>
+              <w:bottom w:w="100" w:type="dxa"/>
+              <w:left w:w="120" w:type="dxa"/>
+              <w:right w:w="120" w:type="dxa"/>
+            </w:tcMar>
+          </w:tcPr>
+          <w:p>
+            <w:pPr>
+              <w:spacing w:before="80" w:after="80"/>
+              <w:jc w:val="left"/>
+            </w:pPr>
+            <w:r/>
+            <w:r>
+              <w:rPr>
+                <w:rFonts w:ascii="Aptos" w:hAnsi="Aptos"/>
+                <w:b w:val="0"/>
+                <w:i w:val="0"/>
+                <w:color w:val="333333"/>
+                <w:sz w:val="20"/>
+                <w:rFonts w:ascii="Aptos" w:hAnsi="Aptos"/>
+              </w:rPr>
+              <w:t>dim_card</w:t>
+            </w:r>
+          </w:p>
+        </w:tc>
+        <w:tc>
+          <w:tcPr>
+            <w:tcW w:type="dxa" w:w="1728"/>
+            <w:tcMar>
+              <w:top w:w="100" w:type="dxa"/>
+              <w:bottom w:w="100" w:type="dxa"/>
+              <w:left w:w="120" w:type="dxa"/>
+              <w:right w:w="120" w:type="dxa"/>
+            </w:tcMar>
+          </w:tcPr>
+          <w:p>
+            <w:pPr>
+              <w:spacing w:before="80" w:after="80"/>
+              <w:jc w:val="left"/>
+            </w:pPr>
+            <w:r/>
+            <w:r>
+              <w:rPr>
+                <w:rFonts w:ascii="Aptos" w:hAnsi="Aptos"/>
+                <w:b w:val="0"/>
+                <w:i w:val="0"/>
+                <w:color w:val="333333"/>
+                <w:sz w:val="20"/>
+                <w:rFonts w:ascii="Aptos" w:hAnsi="Aptos"/>
+              </w:rPr>
+              <w:t>Table</w:t>
+            </w:r>
+          </w:p>
+        </w:tc>
+        <w:tc>
+          <w:tcPr>
+            <w:tcW w:type="dxa" w:w="1728"/>
+            <w:tcMar>
+              <w:top w:w="100" w:type="dxa"/>
+              <w:bottom w:w="100" w:type="dxa"/>
+              <w:left w:w="120" w:type="dxa"/>
+              <w:right w:w="120" w:type="dxa"/>
+            </w:tcMar>
+          </w:tcPr>
+          <w:p>
+            <w:pPr>
+              <w:spacing w:before="80" w:after="80"/>
+              <w:jc w:val="left"/>
+            </w:pPr>
+            <w:r/>
+            <w:r>
+              <w:rPr>
+                <w:rFonts w:ascii="Aptos" w:hAnsi="Aptos"/>
+                <w:b w:val="0"/>
+                <w:i w:val="0"/>
+                <w:color w:val="333333"/>
+                <w:sz w:val="20"/>
+                <w:rFonts w:ascii="Aptos" w:hAnsi="Aptos"/>
+              </w:rPr>
+              <w:t>Foreign Key</w:t>
+            </w:r>
+          </w:p>
+        </w:tc>
+        <w:tc>
+          <w:tcPr>
+            <w:tcW w:type="dxa" w:w="1728"/>
+            <w:tcMar>
+              <w:top w:w="100" w:type="dxa"/>
+              <w:bottom w:w="100" w:type="dxa"/>
+              <w:left w:w="120" w:type="dxa"/>
+              <w:right w:w="120" w:type="dxa"/>
+            </w:tcMar>
+          </w:tcPr>
+          <w:p>
+            <w:pPr>
+              <w:spacing w:before="80" w:after="80"/>
+              <w:jc w:val="left"/>
+            </w:pPr>
+            <w:r/>
+            <w:r>
+              <w:rPr>
+                <w:rFonts w:ascii="Aptos" w:hAnsi="Aptos"/>
+                <w:b w:val="0"/>
+                <w:i w:val="0"/>
+                <w:color w:val="333333"/>
+                <w:sz w:val="20"/>
+                <w:rFonts w:ascii="Aptos" w:hAnsi="Aptos"/>
+              </w:rPr>
+              <w:t>card_id</w:t>
+            </w:r>
+          </w:p>
+        </w:tc>
+      </w:tr>
+      <w:tr>
+        <w:tc>
+          <w:tcPr>
+            <w:tcW w:type="dxa" w:w="1728"/>
+            <w:shd w:val="clear" w:color="auto" w:fill="EAF1F5"/>
+            <w:tcMar>
+              <w:top w:w="100" w:type="dxa"/>
+              <w:bottom w:w="100" w:type="dxa"/>
+              <w:left w:w="120" w:type="dxa"/>
+              <w:right w:w="120" w:type="dxa"/>
+            </w:tcMar>
+          </w:tcPr>
+          <w:p>
+            <w:pPr>
+              <w:spacing w:before="80" w:after="80"/>
+              <w:jc w:val="left"/>
+            </w:pPr>
+            <w:r/>
+            <w:r>
+              <w:rPr>
+                <w:rFonts w:ascii="Aptos" w:hAnsi="Aptos"/>
+                <w:b/>
+                <w:i w:val="0"/>
+                <w:color w:val="0F4761"/>
+                <w:sz w:val="20"/>
+                <w:rFonts w:ascii="Aptos" w:hAnsi="Aptos"/>
+              </w:rPr>
+              <w:t>dim_account</w:t>
+            </w:r>
+          </w:p>
+        </w:tc>
+        <w:tc>
+          <w:tcPr>
+            <w:tcW w:type="dxa" w:w="1728"/>
+            <w:tcMar>
+              <w:top w:w="100" w:type="dxa"/>
+              <w:bottom w:w="100" w:type="dxa"/>
+              <w:left w:w="120" w:type="dxa"/>
+              <w:right w:w="120" w:type="dxa"/>
+            </w:tcMar>
+          </w:tcPr>
+          <w:p>
+            <w:pPr>
+              <w:spacing w:before="80" w:after="80"/>
+              <w:jc w:val="left"/>
+            </w:pPr>
+            <w:r/>
+            <w:r>
+              <w:rPr>
+                <w:rFonts w:ascii="Aptos" w:hAnsi="Aptos"/>
+                <w:b w:val="0"/>
+                <w:i w:val="0"/>
+                <w:color w:val="333333"/>
+                <w:sz w:val="20"/>
+                <w:rFonts w:ascii="Aptos" w:hAnsi="Aptos"/>
+              </w:rPr>
+              <w:t>dim_branch</w:t>
+            </w:r>
+          </w:p>
+        </w:tc>
+        <w:tc>
+          <w:tcPr>
+            <w:tcW w:type="dxa" w:w="1728"/>
+            <w:tcMar>
+              <w:top w:w="100" w:type="dxa"/>
+              <w:bottom w:w="100" w:type="dxa"/>
+              <w:left w:w="120" w:type="dxa"/>
+              <w:right w:w="120" w:type="dxa"/>
+            </w:tcMar>
+          </w:tcPr>
+          <w:p>
+            <w:pPr>
+              <w:spacing w:before="80" w:after="80"/>
+              <w:jc w:val="left"/>
+            </w:pPr>
+            <w:r/>
+            <w:r>
+              <w:rPr>
+                <w:rFonts w:ascii="Aptos" w:hAnsi="Aptos"/>
+                <w:b w:val="0"/>
+                <w:i w:val="0"/>
+                <w:color w:val="333333"/>
+                <w:sz w:val="20"/>
+                <w:rFonts w:ascii="Aptos" w:hAnsi="Aptos"/>
+              </w:rPr>
+              <w:t>Table</w:t>
+            </w:r>
+          </w:p>
+        </w:tc>
+        <w:tc>
+          <w:tcPr>
+            <w:tcW w:type="dxa" w:w="1728"/>
+            <w:tcMar>
+              <w:top w:w="100" w:type="dxa"/>
+              <w:bottom w:w="100" w:type="dxa"/>
+              <w:left w:w="120" w:type="dxa"/>
+              <w:right w:w="120" w:type="dxa"/>
+            </w:tcMar>
+          </w:tcPr>
+          <w:p>
+            <w:pPr>
+              <w:spacing w:before="80" w:after="80"/>
+              <w:jc w:val="left"/>
+            </w:pPr>
+            <w:r/>
+            <w:r>
+              <w:rPr>
+                <w:rFonts w:ascii="Aptos" w:hAnsi="Aptos"/>
+                <w:b w:val="0"/>
+                <w:i w:val="0"/>
+                <w:color w:val="333333"/>
+                <w:sz w:val="20"/>
+                <w:rFonts w:ascii="Aptos" w:hAnsi="Aptos"/>
+              </w:rPr>
+              <w:t>Foreign Key</w:t>
+            </w:r>
+          </w:p>
+        </w:tc>
+        <w:tc>
+          <w:tcPr>
+            <w:tcW w:type="dxa" w:w="1728"/>
+            <w:tcMar>
+              <w:top w:w="100" w:type="dxa"/>
+              <w:bottom w:w="100" w:type="dxa"/>
+              <w:left w:w="120" w:type="dxa"/>
+              <w:right w:w="120" w:type="dxa"/>
+            </w:tcMar>
+          </w:tcPr>
+          <w:p>
+            <w:pPr>
+              <w:spacing w:before="80" w:after="80"/>
+              <w:jc w:val="left"/>
+            </w:pPr>
+            <w:r/>
+            <w:r>
+              <w:rPr>
+                <w:rFonts w:ascii="Aptos" w:hAnsi="Aptos"/>
+                <w:b w:val="0"/>
+                <w:i w:val="0"/>
+                <w:color w:val="333333"/>
+                <w:sz w:val="20"/>
+                <w:rFonts w:ascii="Aptos" w:hAnsi="Aptos"/>
+              </w:rPr>
+              <w:t>branch_id</w:t>
+            </w:r>
+          </w:p>
+        </w:tc>
+      </w:tr>
+      <w:tr>
+        <w:tc>
+          <w:tcPr>
+            <w:tcW w:type="dxa" w:w="1728"/>
+            <w:shd w:val="clear" w:color="auto" w:fill="EAF1F5"/>
+            <w:tcMar>
+              <w:top w:w="100" w:type="dxa"/>
+              <w:bottom w:w="100" w:type="dxa"/>
+              <w:left w:w="120" w:type="dxa"/>
+              <w:right w:w="120" w:type="dxa"/>
+            </w:tcMar>
+          </w:tcPr>
+          <w:p>
+            <w:pPr>
+              <w:spacing w:before="80" w:after="80"/>
+              <w:jc w:val="left"/>
+            </w:pPr>
+            <w:r/>
+            <w:r>
+              <w:rPr>
+                <w:rFonts w:ascii="Aptos" w:hAnsi="Aptos"/>
+                <w:b/>
+                <w:i w:val="0"/>
+                <w:color w:val="0F4761"/>
+                <w:sz w:val="20"/>
+                <w:rFonts w:ascii="Aptos" w:hAnsi="Aptos"/>
+              </w:rPr>
+              <w:t>dim_branch</w:t>
+            </w:r>
+          </w:p>
+        </w:tc>
+        <w:tc>
+          <w:tcPr>
+            <w:tcW w:type="dxa" w:w="1728"/>
+            <w:tcMar>
+              <w:top w:w="100" w:type="dxa"/>
+              <w:bottom w:w="100" w:type="dxa"/>
+              <w:left w:w="120" w:type="dxa"/>
+              <w:right w:w="120" w:type="dxa"/>
+            </w:tcMar>
+          </w:tcPr>
+          <w:p>
+            <w:pPr>
+              <w:spacing w:before="80" w:after="80"/>
+              <w:jc w:val="left"/>
+            </w:pPr>
+            <w:r/>
+            <w:r>
+              <w:rPr>
+                <w:rFonts w:ascii="Aptos" w:hAnsi="Aptos"/>
+                <w:b w:val="0"/>
+                <w:i w:val="0"/>
+                <w:color w:val="333333"/>
+                <w:sz w:val="20"/>
+                <w:rFonts w:ascii="Aptos" w:hAnsi="Aptos"/>
+              </w:rPr>
+              <w:t>None</w:t>
+            </w:r>
+          </w:p>
+        </w:tc>
+        <w:tc>
+          <w:tcPr>
+            <w:tcW w:type="dxa" w:w="1728"/>
+            <w:tcMar>
+              <w:top w:w="100" w:type="dxa"/>
+              <w:bottom w:w="100" w:type="dxa"/>
+              <w:left w:w="120" w:type="dxa"/>
+              <w:right w:w="120" w:type="dxa"/>
+            </w:tcMar>
+          </w:tcPr>
+          <w:p>
+            <w:pPr>
+              <w:spacing w:before="80" w:after="80"/>
+              <w:jc w:val="left"/>
+            </w:pPr>
+            <w:r/>
+            <w:r>
+              <w:rPr>
+                <w:rFonts w:ascii="Aptos" w:hAnsi="Aptos"/>
+                <w:b w:val="0"/>
+                <w:i w:val="0"/>
+                <w:color w:val="333333"/>
+                <w:sz w:val="20"/>
+                <w:rFonts w:ascii="Aptos" w:hAnsi="Aptos"/>
+              </w:rPr>
+              <w:t>Table</w:t>
+            </w:r>
+          </w:p>
+        </w:tc>
+        <w:tc>
+          <w:tcPr>
+            <w:tcW w:type="dxa" w:w="1728"/>
+            <w:tcMar>
+              <w:top w:w="100" w:type="dxa"/>
+              <w:bottom w:w="100" w:type="dxa"/>
+              <w:left w:w="120" w:type="dxa"/>
+              <w:right w:w="120" w:type="dxa"/>
+            </w:tcMar>
+          </w:tcPr>
+          <w:p>
+            <w:pPr>
+              <w:spacing w:before="80" w:after="80"/>
+              <w:jc w:val="left"/>
+            </w:pPr>
+            <w:r/>
+            <w:r>
+              <w:rPr>
+                <w:rFonts w:ascii="Aptos" w:hAnsi="Aptos"/>
+                <w:b w:val="0"/>
+                <w:i w:val="0"/>
+                <w:color w:val="333333"/>
+                <w:sz w:val="20"/>
+                <w:rFonts w:ascii="Aptos" w:hAnsi="Aptos"/>
+              </w:rPr>
+              <w:t>None</w:t>
+            </w:r>
+          </w:p>
+        </w:tc>
+        <w:tc>
+          <w:tcPr>
+            <w:tcW w:type="dxa" w:w="1728"/>
+            <w:tcMar>
+              <w:top w:w="100" w:type="dxa"/>
+              <w:bottom w:w="100" w:type="dxa"/>
+              <w:left w:w="120" w:type="dxa"/>
+              <w:right w:w="120" w:type="dxa"/>
+            </w:tcMar>
+          </w:tcPr>
+          <w:p>
+            <w:pPr>
+              <w:spacing w:before="80" w:after="80"/>
+              <w:jc w:val="left"/>
+            </w:pPr>
+            <w:r/>
+            <w:r>
+              <w:rPr>
+                <w:rFonts w:ascii="Aptos" w:hAnsi="Aptos"/>
+                <w:b w:val="0"/>
+                <w:i w:val="0"/>
+                <w:color w:val="333333"/>
+                <w:sz w:val="20"/>
+                <w:rFonts w:ascii="Aptos" w:hAnsi="Aptos"/>
+              </w:rPr>
+              <w:t>None</w:t>
             </w:r>
           </w:p>
         </w:tc>
@@ -2773,6 +3974,23 @@
     </w:p>
     <w:p>
       <w:pPr>
+        <w:pStyle w:val="ListBullet"/>
+        <w:spacing w:after="80"/>
+        <w:jc w:val="both"/>
+      </w:pPr>
+      <w:r>
+        <w:rPr>
+          <w:rFonts w:ascii="Aptos" w:hAnsi="Aptos"/>
+          <w:b w:val="0"/>
+          <w:i w:val="0"/>
+          <w:sz w:val="24"/>
+          <w:rFonts w:ascii="Aptos" w:hAnsi="Aptos"/>
+        </w:rPr>
+        <w:t>dim_branch</w:t>
+      </w:r>
+    </w:p>
+    <w:p>
+      <w:pPr>
         <w:spacing w:before="120" w:after="60"/>
         <w:jc w:val="left"/>
       </w:pPr>
@@ -2803,6 +4021,40 @@
           <w:rFonts w:ascii="Aptos" w:hAnsi="Aptos"/>
         </w:rPr>
         <w:t>fact_card_transaction</w:t>
+      </w:r>
+    </w:p>
+    <w:p>
+      <w:pPr>
+        <w:pStyle w:val="ListBullet"/>
+        <w:spacing w:after="80"/>
+        <w:jc w:val="both"/>
+      </w:pPr>
+      <w:r>
+        <w:rPr>
+          <w:rFonts w:ascii="Aptos" w:hAnsi="Aptos"/>
+          <w:b w:val="0"/>
+          <w:i w:val="0"/>
+          <w:sz w:val="24"/>
+          <w:rFonts w:ascii="Aptos" w:hAnsi="Aptos"/>
+        </w:rPr>
+        <w:t>fact_dispute</w:t>
+      </w:r>
+    </w:p>
+    <w:p>
+      <w:pPr>
+        <w:pStyle w:val="ListBullet"/>
+        <w:spacing w:after="80"/>
+        <w:jc w:val="both"/>
+      </w:pPr>
+      <w:r>
+        <w:rPr>
+          <w:rFonts w:ascii="Aptos" w:hAnsi="Aptos"/>
+          <w:b w:val="0"/>
+          <w:i w:val="0"/>
+          <w:sz w:val="24"/>
+          <w:rFonts w:ascii="Aptos" w:hAnsi="Aptos"/>
+        </w:rPr>
+        <w:t>dim_account</w:t>
       </w:r>
     </w:p>
     <w:p>
@@ -3152,6 +4404,125 @@
                 <w:sz w:val="20"/>
                 <w:rFonts w:ascii="Aptos" w:hAnsi="Aptos"/>
               </w:rPr>
+              <w:t>1</w:t>
+            </w:r>
+          </w:p>
+        </w:tc>
+        <w:tc>
+          <w:tcPr>
+            <w:tcW w:type="dxa" w:w="2160"/>
+            <w:tcMar>
+              <w:top w:w="100" w:type="dxa"/>
+              <w:bottom w:w="100" w:type="dxa"/>
+              <w:left w:w="120" w:type="dxa"/>
+              <w:right w:w="120" w:type="dxa"/>
+            </w:tcMar>
+          </w:tcPr>
+          <w:p>
+            <w:pPr>
+              <w:spacing w:before="80" w:after="80"/>
+              <w:jc w:val="left"/>
+            </w:pPr>
+            <w:r/>
+            <w:r>
+              <w:rPr>
+                <w:rFonts w:ascii="Aptos" w:hAnsi="Aptos"/>
+                <w:b w:val="0"/>
+                <w:i w:val="0"/>
+                <w:color w:val="333333"/>
+                <w:sz w:val="20"/>
+                <w:rFonts w:ascii="Aptos" w:hAnsi="Aptos"/>
+              </w:rPr>
+              <w:t>dim_branch</w:t>
+            </w:r>
+          </w:p>
+        </w:tc>
+        <w:tc>
+          <w:tcPr>
+            <w:tcW w:type="dxa" w:w="2160"/>
+            <w:tcMar>
+              <w:top w:w="100" w:type="dxa"/>
+              <w:bottom w:w="100" w:type="dxa"/>
+              <w:left w:w="120" w:type="dxa"/>
+              <w:right w:w="120" w:type="dxa"/>
+            </w:tcMar>
+          </w:tcPr>
+          <w:p>
+            <w:pPr>
+              <w:spacing w:before="80" w:after="80"/>
+              <w:jc w:val="left"/>
+            </w:pPr>
+            <w:r/>
+            <w:r>
+              <w:rPr>
+                <w:rFonts w:ascii="Aptos" w:hAnsi="Aptos"/>
+                <w:b w:val="0"/>
+                <w:i w:val="0"/>
+                <w:color w:val="333333"/>
+                <w:sz w:val="20"/>
+                <w:rFonts w:ascii="Aptos" w:hAnsi="Aptos"/>
+              </w:rPr>
+              <w:t>Table</w:t>
+            </w:r>
+          </w:p>
+        </w:tc>
+        <w:tc>
+          <w:tcPr>
+            <w:tcW w:type="dxa" w:w="2160"/>
+            <w:tcMar>
+              <w:top w:w="100" w:type="dxa"/>
+              <w:bottom w:w="100" w:type="dxa"/>
+              <w:left w:w="120" w:type="dxa"/>
+              <w:right w:w="120" w:type="dxa"/>
+            </w:tcMar>
+          </w:tcPr>
+          <w:p>
+            <w:pPr>
+              <w:spacing w:before="80" w:after="80"/>
+              <w:jc w:val="left"/>
+            </w:pPr>
+            <w:r/>
+            <w:r>
+              <w:rPr>
+                <w:rFonts w:ascii="Aptos" w:hAnsi="Aptos"/>
+                <w:b w:val="0"/>
+                <w:i w:val="0"/>
+                <w:color w:val="333333"/>
+                <w:sz w:val="20"/>
+                <w:rFonts w:ascii="Aptos" w:hAnsi="Aptos"/>
+              </w:rPr>
+              <w:t>Independent</w:t>
+            </w:r>
+          </w:p>
+        </w:tc>
+      </w:tr>
+      <w:tr>
+        <w:tc>
+          <w:tcPr>
+            <w:tcW w:type="dxa" w:w="2160"/>
+            <w:shd w:val="clear" w:color="auto" w:fill="EAF1F5"/>
+            <w:tcMar>
+              <w:top w:w="100" w:type="dxa"/>
+              <w:bottom w:w="100" w:type="dxa"/>
+              <w:left w:w="120" w:type="dxa"/>
+              <w:right w:w="120" w:type="dxa"/>
+            </w:tcMar>
+          </w:tcPr>
+          <w:p>
+            <w:pPr>
+              <w:spacing w:before="80" w:after="80"/>
+              <w:jc w:val="left"/>
+            </w:pPr>
+            <w:r/>
+            <w:r>
+              <w:rPr>
+                <w:rFonts w:ascii="Aptos" w:hAnsi="Aptos"/>
+                <w:b/>
+                <w:i w:val="0"/>
+                <w:color w:val="0F4761"/>
+                <w:sz w:val="20"/>
+                <w:rFonts w:ascii="Aptos" w:hAnsi="Aptos"/>
+              </w:rPr>
               <w:t>2</w:t>
             </w:r>
           </w:p>
@@ -3182,6 +4553,244 @@
                 <w:rFonts w:ascii="Aptos" w:hAnsi="Aptos"/>
               </w:rPr>
               <w:t>fact_card_transaction</w:t>
+            </w:r>
+          </w:p>
+        </w:tc>
+        <w:tc>
+          <w:tcPr>
+            <w:tcW w:type="dxa" w:w="2160"/>
+            <w:tcMar>
+              <w:top w:w="100" w:type="dxa"/>
+              <w:bottom w:w="100" w:type="dxa"/>
+              <w:left w:w="120" w:type="dxa"/>
+              <w:right w:w="120" w:type="dxa"/>
+            </w:tcMar>
+          </w:tcPr>
+          <w:p>
+            <w:pPr>
+              <w:spacing w:before="80" w:after="80"/>
+              <w:jc w:val="left"/>
+            </w:pPr>
+            <w:r/>
+            <w:r>
+              <w:rPr>
+                <w:rFonts w:ascii="Aptos" w:hAnsi="Aptos"/>
+                <w:b w:val="0"/>
+                <w:i w:val="0"/>
+                <w:color w:val="333333"/>
+                <w:sz w:val="20"/>
+                <w:rFonts w:ascii="Aptos" w:hAnsi="Aptos"/>
+              </w:rPr>
+              <w:t>Table</w:t>
+            </w:r>
+          </w:p>
+        </w:tc>
+        <w:tc>
+          <w:tcPr>
+            <w:tcW w:type="dxa" w:w="2160"/>
+            <w:tcMar>
+              <w:top w:w="100" w:type="dxa"/>
+              <w:bottom w:w="100" w:type="dxa"/>
+              <w:left w:w="120" w:type="dxa"/>
+              <w:right w:w="120" w:type="dxa"/>
+            </w:tcMar>
+          </w:tcPr>
+          <w:p>
+            <w:pPr>
+              <w:spacing w:before="80" w:after="80"/>
+              <w:jc w:val="left"/>
+            </w:pPr>
+            <w:r/>
+            <w:r>
+              <w:rPr>
+                <w:rFonts w:ascii="Aptos" w:hAnsi="Aptos"/>
+                <w:b w:val="0"/>
+                <w:i w:val="0"/>
+                <w:color w:val="333333"/>
+                <w:sz w:val="20"/>
+                <w:rFonts w:ascii="Aptos" w:hAnsi="Aptos"/>
+              </w:rPr>
+              <w:t>Dependent on dim_card</w:t>
+            </w:r>
+          </w:p>
+        </w:tc>
+      </w:tr>
+      <w:tr>
+        <w:tc>
+          <w:tcPr>
+            <w:tcW w:type="dxa" w:w="2160"/>
+            <w:shd w:val="clear" w:color="auto" w:fill="EAF1F5"/>
+            <w:tcMar>
+              <w:top w:w="100" w:type="dxa"/>
+              <w:bottom w:w="100" w:type="dxa"/>
+              <w:left w:w="120" w:type="dxa"/>
+              <w:right w:w="120" w:type="dxa"/>
+            </w:tcMar>
+          </w:tcPr>
+          <w:p>
+            <w:pPr>
+              <w:spacing w:before="80" w:after="80"/>
+              <w:jc w:val="left"/>
+            </w:pPr>
+            <w:r/>
+            <w:r>
+              <w:rPr>
+                <w:rFonts w:ascii="Aptos" w:hAnsi="Aptos"/>
+                <w:b/>
+                <w:i w:val="0"/>
+                <w:color w:val="0F4761"/>
+                <w:sz w:val="20"/>
+                <w:rFonts w:ascii="Aptos" w:hAnsi="Aptos"/>
+              </w:rPr>
+              <w:t>2</w:t>
+            </w:r>
+          </w:p>
+        </w:tc>
+        <w:tc>
+          <w:tcPr>
+            <w:tcW w:type="dxa" w:w="2160"/>
+            <w:tcMar>
+              <w:top w:w="100" w:type="dxa"/>
+              <w:bottom w:w="100" w:type="dxa"/>
+              <w:left w:w="120" w:type="dxa"/>
+              <w:right w:w="120" w:type="dxa"/>
+            </w:tcMar>
+          </w:tcPr>
+          <w:p>
+            <w:pPr>
+              <w:spacing w:before="80" w:after="80"/>
+              <w:jc w:val="left"/>
+            </w:pPr>
+            <w:r/>
+            <w:r>
+              <w:rPr>
+                <w:rFonts w:ascii="Aptos" w:hAnsi="Aptos"/>
+                <w:b w:val="0"/>
+                <w:i w:val="0"/>
+                <w:color w:val="333333"/>
+                <w:sz w:val="20"/>
+                <w:rFonts w:ascii="Aptos" w:hAnsi="Aptos"/>
+              </w:rPr>
+              <w:t>dim_account</w:t>
+            </w:r>
+          </w:p>
+        </w:tc>
+        <w:tc>
+          <w:tcPr>
+            <w:tcW w:type="dxa" w:w="2160"/>
+            <w:tcMar>
+              <w:top w:w="100" w:type="dxa"/>
+              <w:bottom w:w="100" w:type="dxa"/>
+              <w:left w:w="120" w:type="dxa"/>
+              <w:right w:w="120" w:type="dxa"/>
+            </w:tcMar>
+          </w:tcPr>
+          <w:p>
+            <w:pPr>
+              <w:spacing w:before="80" w:after="80"/>
+              <w:jc w:val="left"/>
+            </w:pPr>
+            <w:r/>
+            <w:r>
+              <w:rPr>
+                <w:rFonts w:ascii="Aptos" w:hAnsi="Aptos"/>
+                <w:b w:val="0"/>
+                <w:i w:val="0"/>
+                <w:color w:val="333333"/>
+                <w:sz w:val="20"/>
+                <w:rFonts w:ascii="Aptos" w:hAnsi="Aptos"/>
+              </w:rPr>
+              <w:t>Table</w:t>
+            </w:r>
+          </w:p>
+        </w:tc>
+        <w:tc>
+          <w:tcPr>
+            <w:tcW w:type="dxa" w:w="2160"/>
+            <w:tcMar>
+              <w:top w:w="100" w:type="dxa"/>
+              <w:bottom w:w="100" w:type="dxa"/>
+              <w:left w:w="120" w:type="dxa"/>
+              <w:right w:w="120" w:type="dxa"/>
+            </w:tcMar>
+          </w:tcPr>
+          <w:p>
+            <w:pPr>
+              <w:spacing w:before="80" w:after="80"/>
+              <w:jc w:val="left"/>
+            </w:pPr>
+            <w:r/>
+            <w:r>
+              <w:rPr>
+                <w:rFonts w:ascii="Aptos" w:hAnsi="Aptos"/>
+                <w:b w:val="0"/>
+                <w:i w:val="0"/>
+                <w:color w:val="333333"/>
+                <w:sz w:val="20"/>
+                <w:rFonts w:ascii="Aptos" w:hAnsi="Aptos"/>
+              </w:rPr>
+              <w:t>Dependent on dim_branch</w:t>
+            </w:r>
+          </w:p>
+        </w:tc>
+      </w:tr>
+      <w:tr>
+        <w:tc>
+          <w:tcPr>
+            <w:tcW w:type="dxa" w:w="2160"/>
+            <w:shd w:val="clear" w:color="auto" w:fill="EAF1F5"/>
+            <w:tcMar>
+              <w:top w:w="100" w:type="dxa"/>
+              <w:bottom w:w="100" w:type="dxa"/>
+              <w:left w:w="120" w:type="dxa"/>
+              <w:right w:w="120" w:type="dxa"/>
+            </w:tcMar>
+          </w:tcPr>
+          <w:p>
+            <w:pPr>
+              <w:spacing w:before="80" w:after="80"/>
+              <w:jc w:val="left"/>
+            </w:pPr>
+            <w:r/>
+            <w:r>
+              <w:rPr>
+                <w:rFonts w:ascii="Aptos" w:hAnsi="Aptos"/>
+                <w:b/>
+                <w:i w:val="0"/>
+                <w:color w:val="0F4761"/>
+                <w:sz w:val="20"/>
+                <w:rFonts w:ascii="Aptos" w:hAnsi="Aptos"/>
+              </w:rPr>
+              <w:t>2</w:t>
+            </w:r>
+          </w:p>
+        </w:tc>
+        <w:tc>
+          <w:tcPr>
+            <w:tcW w:type="dxa" w:w="2160"/>
+            <w:tcMar>
+              <w:top w:w="100" w:type="dxa"/>
+              <w:bottom w:w="100" w:type="dxa"/>
+              <w:left w:w="120" w:type="dxa"/>
+              <w:right w:w="120" w:type="dxa"/>
+            </w:tcMar>
+          </w:tcPr>
+          <w:p>
+            <w:pPr>
+              <w:spacing w:before="80" w:after="80"/>
+              <w:jc w:val="left"/>
+            </w:pPr>
+            <w:r/>
+            <w:r>
+              <w:rPr>
+                <w:rFonts w:ascii="Aptos" w:hAnsi="Aptos"/>
+                <w:b w:val="0"/>
+                <w:i w:val="0"/>
+                <w:color w:val="333333"/>
+                <w:sz w:val="20"/>
+                <w:rFonts w:ascii="Aptos" w:hAnsi="Aptos"/>
+              </w:rPr>
+              <w:t>fact_dispute</w:t>
             </w:r>
           </w:p>
         </w:tc>
@@ -3348,6 +4957,23 @@
     </w:p>
     <w:p>
       <w:pPr>
+        <w:pStyle w:val="ListBullet"/>
+        <w:spacing w:after="80"/>
+        <w:jc w:val="both"/>
+      </w:pPr>
+      <w:r>
+        <w:rPr>
+          <w:rFonts w:ascii="Aptos" w:hAnsi="Aptos"/>
+          <w:b w:val="0"/>
+          <w:i w:val="0"/>
+          <w:sz w:val="24"/>
+          <w:rFonts w:ascii="Aptos" w:hAnsi="Aptos"/>
+        </w:rPr>
+        <w:t>dim_branch</w:t>
+      </w:r>
+    </w:p>
+    <w:p>
+      <w:pPr>
         <w:spacing w:before="120" w:after="60"/>
         <w:jc w:val="left"/>
       </w:pPr>
@@ -3416,6 +5042,40 @@
     </w:p>
     <w:p>
       <w:pPr>
+        <w:pStyle w:val="ListBullet"/>
+        <w:spacing w:after="80"/>
+        <w:jc w:val="both"/>
+      </w:pPr>
+      <w:r>
+        <w:rPr>
+          <w:rFonts w:ascii="Aptos" w:hAnsi="Aptos"/>
+          <w:b w:val="0"/>
+          <w:i w:val="0"/>
+          <w:sz w:val="24"/>
+          <w:rFonts w:ascii="Aptos" w:hAnsi="Aptos"/>
+        </w:rPr>
+        <w:t>fact_dispute</w:t>
+      </w:r>
+    </w:p>
+    <w:p>
+      <w:pPr>
+        <w:pStyle w:val="ListBullet"/>
+        <w:spacing w:after="80"/>
+        <w:jc w:val="both"/>
+      </w:pPr>
+      <w:r>
+        <w:rPr>
+          <w:rFonts w:ascii="Aptos" w:hAnsi="Aptos"/>
+          <w:b w:val="0"/>
+          <w:i w:val="0"/>
+          <w:sz w:val="24"/>
+          <w:rFonts w:ascii="Aptos" w:hAnsi="Aptos"/>
+        </w:rPr>
+        <w:t>dim_account</w:t>
+      </w:r>
+    </w:p>
+    <w:p>
+      <w:pPr>
         <w:spacing w:before="120" w:after="60"/>
         <w:jc w:val="left"/>
       </w:pPr>
@@ -3445,7 +5105,7 @@
           <w:sz w:val="24"/>
           <w:rFonts w:ascii="Aptos" w:hAnsi="Aptos"/>
         </w:rPr>
-        <w:t>archived_orders_view</w:t>
+        <w:t>None</w:t>
       </w:r>
     </w:p>
     <w:p>
@@ -3563,7 +5223,7 @@
           <w:sz w:val="24"/>
           <w:rFonts w:ascii="Aptos" w:hAnsi="Aptos"/>
         </w:rPr>
-        <w:t>credit_card_details_ext_vol (MANAGED, )</w:t>
+        <w:t>volumes_credit_card_details_ext (MANAGED, )</w:t>
       </w:r>
     </w:p>
     <w:p>
@@ -4234,7 +5894,7 @@
                 <w:sz w:val="20"/>
                 <w:rFonts w:ascii="Aptos" w:hAnsi="Aptos"/>
               </w:rPr>
-              <w:t>1 Independent Tables</w:t>
+              <w:t>2 Independent Tables</w:t>
             </w:r>
           </w:p>
         </w:tc>
@@ -4472,7 +6132,7 @@
                 <w:sz w:val="20"/>
                 <w:rFonts w:ascii="Aptos" w:hAnsi="Aptos"/>
               </w:rPr>
-              <w:t>1 Highly Dependent Tables</w:t>
+              <w:t>3 Highly Dependent Tables</w:t>
             </w:r>
           </w:p>
         </w:tc>
@@ -4591,7 +6251,7 @@
                 <w:sz w:val="20"/>
                 <w:rFonts w:ascii="Aptos" w:hAnsi="Aptos"/>
               </w:rPr>
-              <w:t>1 Database Views</w:t>
+              <w:t>0 Database Views</w:t>
             </w:r>
           </w:p>
         </w:tc>
@@ -5130,6 +6790,40 @@
     </w:p>
     <w:p>
       <w:pPr>
+        <w:pStyle w:val="ListBullet"/>
+        <w:spacing w:after="80"/>
+        <w:jc w:val="both"/>
+      </w:pPr>
+      <w:r>
+        <w:rPr>
+          <w:rFonts w:ascii="Aptos" w:hAnsi="Aptos"/>
+          <w:b w:val="0"/>
+          <w:i w:val="0"/>
+          <w:sz w:val="24"/>
+          <w:rFonts w:ascii="Aptos" w:hAnsi="Aptos"/>
+        </w:rPr>
+        <w:t>Full load for fact_dispute (dependent on dim_card).</w:t>
+      </w:r>
+    </w:p>
+    <w:p>
+      <w:pPr>
+        <w:pStyle w:val="ListBullet"/>
+        <w:spacing w:after="80"/>
+        <w:jc w:val="both"/>
+      </w:pPr>
+      <w:r>
+        <w:rPr>
+          <w:rFonts w:ascii="Aptos" w:hAnsi="Aptos"/>
+          <w:b w:val="0"/>
+          <w:i w:val="0"/>
+          <w:sz w:val="24"/>
+          <w:rFonts w:ascii="Aptos" w:hAnsi="Aptos"/>
+        </w:rPr>
+        <w:t>Full load for dim_account (dependent on dim_branch).</w:t>
+      </w:r>
+    </w:p>
+    <w:p>
+      <w:pPr>
         <w:spacing w:after="80"/>
         <w:jc w:val="both"/>
       </w:pPr>
@@ -5158,7 +6852,7 @@
           <w:sz w:val="24"/>
           <w:rFonts w:ascii="Aptos" w:hAnsi="Aptos"/>
         </w:rPr>
-        <w:t>Create all views in target lakehouse schema.</w:t>
+        <w:t>No views to execute.</w:t>
       </w:r>
     </w:p>
     <w:p>
@@ -5537,7 +7231,7 @@
                 <w:sz w:val="20"/>
                 <w:rFonts w:ascii="Aptos" w:hAnsi="Aptos"/>
               </w:rPr>
-              <w:t>13776</w:t>
+              <w:t>19140</w:t>
             </w:r>
           </w:p>
         </w:tc>
@@ -5598,7 +7292,7 @@
                 <w:sz w:val="20"/>
                 <w:rFonts w:ascii="Aptos" w:hAnsi="Aptos"/>
               </w:rPr>
-              <w:t>5405</w:t>
+              <w:t>9255</w:t>
             </w:r>
           </w:p>
         </w:tc>
@@ -5659,7 +7353,7 @@
                 <w:sz w:val="20"/>
                 <w:rFonts w:ascii="Aptos" w:hAnsi="Aptos"/>
               </w:rPr>
-              <w:t>$0.00531</w:t>
+              <w:t>$0.00842</w:t>
             </w:r>
           </w:p>
         </w:tc>

</xml_diff>

<commit_message>
Checkpoint: Snowflake PAT auth, Dynamics 365 dual auth mode, and per-source Fabric artifact generators
- Snowflake: add account/warehouse/role/token connection fields, PAT auth via
  authenticator=PROGRAMMATIC_ACCESS_TOKEN (username still required alongside
  the token - Snowflake validates a PAT against its issuing login name).
- Dynamics 365: support both client-credentials and resource-owner-password
  OAuth2 flows for free/developer environments without an app registration.
- Split DB2_2_Fabric.py into a shared fabric_generator_core.py plus three
  thin per-source entry points (databricks2_fabric.py, sqlserver2_fabric.py,
  dynamics3652_fabric.py) so each source has its own named generator script.

Co-Authored-By: Claude Sonnet 5 <noreply@anthropic.com>
</commit_message>
<xml_diff>
--- a/BackEnd/AI_Agent_Pipeline/output/AI_Migration_Plan.docx
+++ b/BackEnd/AI_Agent_Pipeline/output/AI_Migration_Plan.docx
@@ -3563,7 +3563,7 @@
           <w:sz w:val="24"/>
           <w:rFonts w:ascii="Aptos" w:hAnsi="Aptos"/>
         </w:rPr>
-        <w:t>credit_card_details_ext_vol (MANAGED, )</w:t>
+        <w:t>volumes_credit_card_details_ext (MANAGED, )</w:t>
       </w:r>
     </w:p>
     <w:p>
@@ -5537,7 +5537,7 @@
                 <w:sz w:val="20"/>
                 <w:rFonts w:ascii="Aptos" w:hAnsi="Aptos"/>
               </w:rPr>
-              <w:t>13776</w:t>
+              <w:t>13779</w:t>
             </w:r>
           </w:p>
         </w:tc>
@@ -5598,7 +5598,7 @@
                 <w:sz w:val="20"/>
                 <w:rFonts w:ascii="Aptos" w:hAnsi="Aptos"/>
               </w:rPr>
-              <w:t>5405</w:t>
+              <w:t>6068</w:t>
             </w:r>
           </w:p>
         </w:tc>
@@ -5659,7 +5659,7 @@
                 <w:sz w:val="20"/>
                 <w:rFonts w:ascii="Aptos" w:hAnsi="Aptos"/>
               </w:rPr>
-              <w:t>$0.00531</w:t>
+              <w:t>$0.00571</w:t>
             </w:r>
           </w:p>
         </w:tc>

</xml_diff>